<commit_message>
Refine chapter eleven narrative
</commit_message>
<xml_diff>
--- a/manuscript/chapter-11-the-weakening.docx
+++ b/manuscript/chapter-11-the-weakening.docx
@@ -12,25 +12,32 @@
     </w:p>
     <w:p>
       <w:r>
-        <w:t>Elara sat on the edge of her bed with the lights turned low, the way she had learned to sit when a room could not be trusted to comfort her.</w:t>
+        <w:t>Elara sat on the edge of her bed with the lights turned low.</w:t>
       </w:r>
     </w:p>
     <w:p>
       <w:r>
-        <w:t xml:space="preserve">She had gone as far as Drona would let her go. Anandi's clearance, Kavik's reconstructed ledger path, the legacy firewall pried open by an old filing convention that no interface had displayed in years. She had followed the money from the public record to the departmental copy to the fiscal ledger to the native authorization itself, and at the center of all of it she had found two letters and nothing else. No registry entry. No retired title. No name that matched any pattern she had studied in six years of </w:t>
-      </w:r>
-      <w:r>
-        <w:t>training. OG sat at the bottom of the document like a locked door with no visible combination, and she had spent every avenue those records could offer her trying to find it.</w:t>
+        <w:t>She had taken the library-wing transfer as far as Drona's records could carry her. Anandi had opened the doors her clearance could open. Kavik had rebuilt the ledger path the modern archive no longer displayed. Together, they had moved from the public approval to the departmental copy, from the fiscal ledger to the native authorization itself.</w:t>
       </w:r>
     </w:p>
     <w:p>
       <w:r>
-        <w:t>There was nothing further the archive itself could tell her.</w:t>
+        <w:t>At the center, they had found only two letters.</w:t>
       </w:r>
     </w:p>
     <w:p>
       <w:r>
-        <w:t>The thought should have felt like an ending. Instead it felt like standing at the base of a wall she could not see the top of, with no way to measure how far it went up or how much further it went back before she had arrived.</w:t>
+        <w:t>OG.</w:t>
+      </w:r>
+    </w:p>
+    <w:p>
+      <w:r>
+        <w:t>No registry entry. No retired title. No office, elder, committee, or forgotten designation matched it. The archive accepted the signature, but it would not explain it.</w:t>
+      </w:r>
+    </w:p>
+    <w:p>
+      <w:r>
+        <w:t>That was the wall. Not a locked door she had failed to open, but a wall with no visible top and no visible end.</w:t>
       </w:r>
     </w:p>
     <w:p>
@@ -40,13 +47,23 @@
     </w:p>
     <w:p>
       <w:r>
-        <w:t>She recognized the sensation before she named it. It was not the panic the Ancient One's raised hand had forced into her body in the council chamber, but it was built from the same material: the cold, specific fear of a system that could withhold air, answers, or standing whenever it judged the moment right. Sarvajña's voice returned to her, measured and without embellishment. *Something indescribable has begun to form beneath the scales.* Dra</w:t>
+        <w:t>She recognized the sensation before she named it. It was not the panic the Ancient One's raised hand had forced into her body in the council chamber, but it came from the same place: the fear of a system that could take away air, answers, or standing whenever it chose.</w:t>
+      </w:r>
+    </w:p>
+    <w:p>
+      <w:r>
+        <w:t>Sarvajña's warning returned first. *Something indescribable has begun to form beneath the scales.*</w:t>
+      </w:r>
+    </w:p>
+    <w:p>
+      <w:r>
+        <w:t>Then Dra</w:t>
       </w:r>
       <w:r>
         <w:t>ṣṭ</w:t>
       </w:r>
       <w:r>
-        <w:t>ā's cards returned with it, arranged in her memory exactly as they had been arranged on the table. Trishanku, suspended between categories. Ashwatthama, a conflict that could not be ended. Rahu, danger that kept arriving and could not be swallowed whole.</w:t>
+        <w:t>ā's cards returned with it. Trishanku, suspended between categories. Ashwatthama, conflict that could not end. Rahu, danger that kept coming back.</w:t>
       </w:r>
     </w:p>
     <w:p>
@@ -62,7 +79,7 @@
     </w:p>
     <w:p>
       <w:r>
-        <w:t>Elara did not know what she was preparing for. She only knew that the preparation had a shape now, two letters wide, and that she had reached the limit of what her own gana could show her.</w:t>
+        <w:t>Elara still did not know what she was preparing for. She only knew it had a shape now, two letters wide, and that Drona alone could not show her what stood behind it.</w:t>
       </w:r>
     </w:p>
     <w:p>
@@ -77,11 +94,18 @@
     </w:p>
     <w:p>
       <w:r>
-        <w:t xml:space="preserve">He recognized that this should have troubled him. A man moving against another gana in secret, carrying a power he did not fully understand, working toward something that could </w:t>
+        <w:t>He knew that should have troubled him. He was moving against another gana in secret. He carried a power he did not yet understand. He was starting something that could not be easily undone.</w:t>
       </w:r>
+    </w:p>
+    <w:p>
       <w:r>
         <w:lastRenderedPageBreak/>
-        <w:t>not be undone once set in motion, ought to feel some version of what Elara felt three floors below. It did not. In its place was something closer to hunger, the specific, restless hunger of a man who had spent his life reading limits and had just discovered that his own had been erased.</w:t>
+        <w:t>None of it frightened him.</w:t>
+      </w:r>
+    </w:p>
+    <w:p>
+      <w:r>
+        <w:t>What he felt instead was hunger. For the first time in his life, the limits he had spent years measuring did not seem to apply to him.</w:t>
       </w:r>
     </w:p>
     <w:p>
@@ -101,15 +125,12 @@
     </w:p>
     <w:p>
       <w:r>
-        <w:t>Daren set the pane on his knee and let the words settle where they had settled before, deeper each time.</w:t>
+        <w:t>Daren set the pane on his knee.</w:t>
       </w:r>
     </w:p>
     <w:p>
       <w:r>
-        <w:t>He had spent his career at THRESHOLD reading limits other people pretended did not exist. Intervention bands. Cost triggers. Acceptable-loss curves. He had believed, for years, that this made him a custodian of restraint. The Grandmaster had shown him, in a single sentence, that the same skill pointed in the opposite direction with no more effort than a change in intention. A man who could calculate exactly how much a system could absorb before it broke could also calculate exactly how much a system could b</w:t>
-      </w:r>
-      <w:r>
-        <w:t>e given before the gift became the fracture.</w:t>
+        <w:t>He had spent his career at THRESHOLD reading limits other people pretended did not exist: intervention bands, cost triggers, acceptable-loss curves. He had believed that work was restraint. The Grandmaster had shown him another use for it. A man who knew how much pressure a system could survive also knew how much excess it could be given before the excess became a weakness.</w:t>
       </w:r>
     </w:p>
     <w:p>
@@ -124,19 +145,17 @@
     </w:p>
     <w:p>
       <w:r>
-        <w:t>He had not chosen it only for what it was. He had chosen it for what it had cost him. Elara's correction in front of the others. Elara's report that had preserved three boys the system wanted separated. Elara's name in the audit stream beside a failure the Grandmaster had made him carry into that chamber like a verdict. Revenge did not require declaring itself. It only required patience and the right instrument. Daren had spent his life around instruments that measured what a system could bear. He had never</w:t>
-      </w:r>
-      <w:r>
-        <w:t xml:space="preserve"> before held one that could reach into a system and decide.</w:t>
+        <w:t>He had not chosen Drona only because it was vulnerable to the tactic. He had chosen it because of Elara. Her correction in front of the others. Her report that kept the three boys together. Her name in the audit stream beside the failure the Grandmaster had made him carry like a verdict.</w:t>
       </w:r>
     </w:p>
     <w:p>
       <w:r>
-        <w:t xml:space="preserve">*Weaken with abundance,* the Grandmaster had told him, that night beneath the dark window, when the plan was still only a shape and not yet a decision. *Every gana has </w:t>
+        <w:t>Revenge did not need to announce itself. It only needed patience and the right instrument. Daren had spent his life using instruments that measured what a system could bear. Now he held one that could reach into the system and decide.</w:t>
       </w:r>
+    </w:p>
+    <w:p>
       <w:r>
-        <w:lastRenderedPageBreak/>
-        <w:t>learned to defend against being starved. None of them has learned to defend against being fed too well.*</w:t>
+        <w:t>*Weaken with abundance,* the Grandmaster had told him, that night beneath the dark window, when the plan was still only a shape and not yet a decision. *Every gana has learned to defend against being starved. None of them has learned to defend against being fed too well.*</w:t>
       </w:r>
     </w:p>
     <w:p>
@@ -146,10 +165,13 @@
     </w:p>
     <w:p>
       <w:r>
-        <w:t>The cross-gana requisition ledger was not classified, not truly. It only required a level of patience no one else had time to spend, cross-referencing every gana's outstanding requests against every other gana's internal accounting of what those requests were worth. Elara's people, Daren had learned quickly, ranked almost everything by what it would teach. Kubera ranked everything by what it would return. Between those two measures sat a gap wide enough to drive a decision through, and near the bottom of Ku</w:t>
+        <w:lastRenderedPageBreak/>
+        <w:t>The cross-gana requisition ledger was not truly classified. It was merely tedious, which made it almost as safe as secrecy. Daren cross-checked Drona's open requests against Kubera's internal return projections. Drona ranked a thing by what it could teach. Kubera ranked it by what it would return.</w:t>
       </w:r>
+    </w:p>
+    <w:p>
       <w:r>
-        <w:t>bera's own priority queue, marked in the flattest language his old THRESHOLD station could have produced, he had found it.</w:t>
+        <w:t>In the gap between those two measures, he found the opening.</w:t>
       </w:r>
     </w:p>
     <w:p>
@@ -159,16 +181,7 @@
     </w:p>
     <w:p>
       <w:r>
-        <w:rPr>
-          <w:highlight w:val="yellow"/>
-        </w:rPr>
-        <w:t xml:space="preserve">He had read enough of Drona's own record to understand why the request sat exactly where it did. Its elders spoke of knowledge the way Kubera spoke of reserves, as something to be guarded, expanded, and never allowed to run short. On the rare visits his old station had required of him, he had watched Drona's teachers stand in front of glass cases the way Kubera's founders stood in front of gold. He had heard, more than once, the particular reverence Drona reserved for a sealed archive, a restored fragment, </w:t>
-      </w:r>
-      <w:r>
-        <w:rPr>
-          <w:highlight w:val="yellow"/>
-        </w:rPr>
-        <w:t>a wing no one had been permitted to open in a decade. To Kubera, the request was worth nothing. To Drona, it was worth almost everything it believed itself to be.</w:t>
+        <w:t>He understood why Drona wanted it. Drona treated knowledge the way Kubera treated reserves: something to guard, expand, and never let run short. On the rare visits his old station had required, Daren had seen Drona's teachers stand before glass cases with the reverence Kubera reserved for gold. A sealed archive, a restored fragment, a wing closed for a decade: to Kubera, such things were expensive sentiment. To Drona, they were proof that the gana still served truth.</w:t>
       </w:r>
     </w:p>
     <w:p>
@@ -178,43 +191,41 @@
     </w:p>
     <w:p>
       <w:r>
-        <w:t>Daren understood, sitting with the ledger open before him, that Drona's elder cadre would do exactly what abundance had always taught a well-fed institution to do. They would turn their relentless attention toward the gift, certain that strengthening the library strengthened the very foundation of what Drona believed itself to be. While they counted shelves and sealed cases and celebrated a decade of refusal finally answered, no one would be watching the deeper pillars the library had only ever claimed to s</w:t>
-      </w:r>
-      <w:r>
-        <w:t>erve: gyana itself, the discipline of pursuing worthy knowledge; the rules and regulations built to answer to justice rather than convenience; the hard-won tolerance a whole society had cultivated against corruption, favoritism, and the quiet erosion of what it claimed to value. Those pillars did not live inside one wing of one building. They lived inside every judgment Drona made when no one was measuring the outcome, and a gana consumed by gratitude rarely measured itself as carefully as a gana under thre</w:t>
-      </w:r>
-      <w:r>
-        <w:t>at.</w:t>
+        <w:t>Daren did not believe the library would weaken Drona because books were dangerous. It would weaken Drona because it would turn Drona inward when it should have been watching Kubera.</w:t>
       </w:r>
     </w:p>
     <w:p>
       <w:r>
-        <w:t xml:space="preserve">A gift large enough to answer a decade of refusal would not be questioned as carefully as a gift that matched expectation. It would be received, celebrated in quiet rooms, and folded into the identity of the gana that received it, precisely the identity Drona prized most: patient, deserving, correct. And while its elders turned their attention toward what the gift </w:t>
-      </w:r>
-      <w:r>
-        <w:lastRenderedPageBreak/>
-        <w:t>might let them build, no one would be counting what else moved through the same channel behind it, disguised by an approval no one wanted to interrogate too closely.</w:t>
+        <w:t>The elders would count shelves, restore sealed cases, argue over which records deserved the new wing, and treat the approval as proof that their patience had finally been honored. Their best minds would be busy protecting the meaning of the gift while Kubera moved through the same account trail that had delivered it.</w:t>
       </w:r>
     </w:p>
     <w:p>
       <w:r>
-        <w:t>Daren had not needed to threaten Drona. He had needed only to feed it something it had wanted for ten years and let its own values do the rest.</w:t>
+        <w:t>The point was not to buy Drona. Drona would reject a bribe it recognized. The point was to give Drona something too noble to suspect. A library expansion could be defended as knowledge, preservation, justice to the past, service to future students. Every defense would make the gift cleaner in Drona's own eyes.</w:t>
       </w:r>
     </w:p>
     <w:p>
       <w:r>
-        <w:t>This was the true weakening. Not the library itself. What the library would let him reach. He believed, without needing the Grandmaster to tell him twice, that resolve was the only wall still standing between Trinity's ganas and the hand now reaching for all of them. A hungry gana defended itself. A satisfied one grew careless with what it valued, and carelessness bent to the shine of wealth exactly as reliably as need ever bent to hunger. If Kubera could not starve Drona into surrender, it could feed Drona</w:t>
-      </w:r>
-      <w:r>
-        <w:t xml:space="preserve"> into forgetting what surrender would look like.</w:t>
+        <w:t>That was where the weakening began. Once Drona accepted abundance from Kubera without understanding why, it would have to protect the purity of that acceptance. Its elders would ask whether the wing was worthy, whether the records were properly restored, whether the money had been used well. Fewer of them would ask what else Kubera had learned from watching them accept it.</w:t>
       </w:r>
     </w:p>
     <w:p>
       <w:r>
-        <w:t>He went further than the ledger required. Where the original request had asked for expansion, Daren authorized double the sum, routed through the same reserve channel that had moved every transaction the Grandmaster trusted him to approve without a second signature. The mechanism did not question him. Continuity Reserve transfers had been built, generations before either of them, to move at the founder tier alone, exempt from the layered approvals that governed ordinary Kubera spending precisely because the</w:t>
+        <w:t>Drona called itself the conscience of the city. Daren did not need to destroy that conscience. He needed to make it busy explaining why the gift was righteous.</w:t>
+      </w:r>
+    </w:p>
+    <w:p>
+      <w:r>
+        <w:t>He went further than the ledger required. The original request had asked for an expansion. Daren authorized double the sum.</w:t>
+      </w:r>
+    </w:p>
+    <w:p>
+      <w:r>
+        <w:t xml:space="preserve">The transfer moved through the Continuity Reserve, the same channel the Grandmaster had taught him to use. Ordinary Kubera spending required layers of approval. Continuity </w:t>
       </w:r>
       <w:r>
-        <w:t>y were never meant to answer to anyone beneath a Grandmaster's own hand. Daren no longer held a Kubera title. He held something the ledger recognized as older and less accountable than any title Kubera had ever printed, and the system, built to trust that authority absolutely, released the funds a second time without asking who had requested them. Drona's own accounts received the doubled sum through the same unquestioned channel, logged as confirmation rather than anomaly.</w:t>
+        <w:lastRenderedPageBreak/>
+        <w:t>Reserve transfers did not. They had been built for founder-tier authority, old enough that the system did not ask the modern questions: Which director requested this? Which office signed? Which account gains? Daren no longer held a Kubera title, but the ledger recognized what the bracelet made him. It released the funds without challenge. Drona's accounts received the doubled sum as confirmation, not anomaly.</w:t>
       </w:r>
     </w:p>
     <w:p>
@@ -234,10 +245,7 @@
     </w:p>
     <w:p>
       <w:r>
-        <w:t>He did not think of himself as a crusader carrying out a sentence against a woman who had humiliated him, though the thought would have been easier to hold. He thought of himself as something steadier than that: the one entrusted to guard Kubera's vision, its wealth, and the future the Grandmaster had promised belonged to it alone. A crusader burned for a single grievance and stopped when the grievance was answered. A guardian did not stop. A guardian only widened what needed protecting until it included ev</w:t>
-      </w:r>
-      <w:r>
-        <w:t>erything.</w:t>
+        <w:t>He did not think of himself as a crusader, though revenge still burned cleanly enough inside him. He thought of himself as something steadier: the guardian of Kubera's vision, its wealth, and the future the Grandmaster had promised belonged to it alone. A crusader stopped when the grievance was answered. A guardian did not stop. A guardian only widened what needed protecting until it included everything.</w:t>
       </w:r>
     </w:p>
     <w:p>
@@ -247,7 +255,6 @@
     </w:p>
     <w:p>
       <w:r>
-        <w:lastRenderedPageBreak/>
         <w:t>Somewhere below him, in a room he had never seen and would likely never enter, a woman he had once accused in front of three watching consoles was awake at an hour meant for sleep, turning over the same two letters he had spent a month arranging never to be found.</w:t>
       </w:r>
     </w:p>
@@ -258,20 +265,38 @@
     </w:p>
     <w:p>
       <w:r>
-        <w:t>Elara did not choose Rohan by accident, and she did not choose him only because he had once stepped between her and Daren's raised temper.</w:t>
+        <w:t>Elara could not keep circling the same two letters inside Drona's archive.</w:t>
       </w:r>
     </w:p>
     <w:p>
       <w:r>
-        <w:t>She had spent the night testing every door Drona could open, and every door had returned the same two letters. If knowledge alone could not move the wall standing in front of her, then knowledge was not the vehicle her karma required tonight. She needed a strength that did not wait for permission before it acted, a valor already proven in a room full of watching consoles, and a fairness old enough that it no longer needed to be argued for. Ashoka did not deliberate over what was right. It enforced what alre</w:t>
-      </w:r>
-      <w:r>
-        <w:t>ady was, and asked its questions afterward.</w:t>
+        <w:t>Knowledge had taken her as far as it could. It had shown her the wall, named the gap, and proved that something stood behind the signature. It could not guard the boys. It could not stop a sealed order from becoming force. It could not make another gana answer for what it did in a corridor, a chamber, or a mine.</w:t>
       </w:r>
     </w:p>
     <w:p>
       <w:r>
-        <w:t>She remembered Rohan's hand flat against Daren's chest, and the seven words that had followed it. *Whatever happens next, I will stand with you.* He had said it once, in a room lit blue, without knowing yet what it might cost him. Tonight she intended to learn whether the promise still held its shape.</w:t>
+        <w:t>If Drona was going to move beyond knowing, it needed a hand that could hold a line.</w:t>
+      </w:r>
+    </w:p>
+    <w:p>
+      <w:r>
+        <w:t>That was when she thought of Ashoka.</w:t>
+      </w:r>
+    </w:p>
+    <w:p>
+      <w:r>
+        <w:t>Not Ashoka as a doctrine of force. Not the force ladder, not the uniforms, not the sanctioned language Trinity used when it wanted violence to sound procedural. She thought of Ashoka at its best: strength held under discipline, valor that did not confuse obedience with justice, and fairness that could stand between a person and an accusation before the accusation became a sentence.</w:t>
+      </w:r>
+    </w:p>
+    <w:p>
+      <w:r>
+        <w:t>Then she thought of Rohan.</w:t>
+      </w:r>
+    </w:p>
+    <w:p>
+      <w:r>
+        <w:lastRenderedPageBreak/>
+        <w:t>She remembered his hand flat against Daren's chest, and the seven words that had followed it. *Whatever happens next, I will stand with you.* He had said it once, in a room lit blue, without knowing yet what it might cost him. Tonight she intended to learn whether the promise still held its shape.</w:t>
       </w:r>
     </w:p>
     <w:p>
@@ -281,28 +306,34 @@
     </w:p>
     <w:p>
       <w:r>
-        <w:t>Three floors below him, or perhaps three above, Daren no longer measured distance from anywhere he had been. The same calculation was working itself out in a different currency.</w:t>
+        <w:t>Elsewhere in Trinity, Daren had stopped measuring himself against the man he had been. The same calculation was working itself out in a different currency.</w:t>
       </w:r>
     </w:p>
     <w:p>
       <w:r>
-        <w:t>Gold could buy silence. It could buy delay, and gratitude, and the particular stillness of an institution too pleased with itself to look for a knife. It could not, by itself, rewrite the rules a system used to decide what counted as loyalty, what counted as evidence, or what counted as a threat worth naming. He had learned that lesson watching his own gana lose every argument that mattered to Chanakya's careful shaping of events. Kubera moved resources. Chanakya moved meaning. Meaning, once moved, was hard</w:t>
-      </w:r>
-      <w:r>
-        <w:t>er to trace back to the hand that had moved it than any sum of money would ever be.</w:t>
+        <w:t>Gold could open a door. It could buy delay, gratitude, and silence. But money could not decide what a thing meant once it entered the record. Kubera could fund the library wing. Chanakya could make that funding look inevitable, reasonable, even necessary. Daren had watched his own gana lose enough arguments to understand the difference: Kubera moved resources, but Chanakya moved the story around them.</w:t>
       </w:r>
     </w:p>
     <w:p>
       <w:r>
-        <w:t>He thought of Ravi at the console on the first day, deciding what an incident was permitted to mean before Elara had finished reading a single figure. He thought of the private, electric attention on Ravi's face the night the boys survived together, not disapproval, not alarm, but the look of a man who suspected he had found the first true variable in a pattern he had not yet been given permission to study. Chanakya trained its representatives to notice exactly that kind of exception. It did not always trai</w:t>
-      </w:r>
-      <w:r>
-        <w:t>n them to leave it alone once they had.</w:t>
+        <w:t>The bracelet gave Daren reach. It did not give him cover. If he pushed too openly, Trinity would feel the pressure and harden around it. Ravi offered a different kind of force: the ability to turn a pressure into an interpretation, and an interpretation into policy.</w:t>
       </w:r>
     </w:p>
     <w:p>
       <w:r>
-        <w:lastRenderedPageBreak/>
+        <w:t>There were older Chanakya officers, sharper ones perhaps, and certainly ones with more authority. Daren did not know them. He knew Ravi. He had watched Ravi work inside a crisis, and that mattered more than rank.</w:t>
+      </w:r>
+    </w:p>
+    <w:p>
+      <w:r>
+        <w:t>Daren thought of Ravi at the console on the first day, deciding what an incident was permitted to mean before Elara had finished reading a single figure. He thought of the private, electric attention on Ravi's face the night the boys survived together, not disapproval, not alarm, but the look of a man who suspected he had found the first true variable in a pattern he had not yet been given permission to study. Chanakya trained its representatives to notice exactly that kind of exception. It did not always t</w:t>
+      </w:r>
+      <w:r>
+        <w:t>rain them to leave it alone once they had.</w:t>
+      </w:r>
+    </w:p>
+    <w:p>
+      <w:r>
         <w:t>If wealth could not bend the fabric of Trinity's law on its own, wealth married to policy could rewrite the loom entirely.</w:t>
       </w:r>
     </w:p>
@@ -313,7 +344,78 @@
     </w:p>
     <w:p>
       <w:r>
-        <w:t>Two rooms. Two ganas each, moving on the same night toward the same unfinished war. Elara reached for a hand that had already promised to hold hers. Daren reached for a hand that had not yet realized how much of itself it stood to lose. Both believed they were choosing their own path. Neither yet understood how much of the road ahead had already been paved by someone who signed every instruction with two letters and no name at all.</w:t>
+        <w:t xml:space="preserve">Two rooms. Two ganas each, moving on the same night toward the same unfinished war. Elara reached for a hand that had already promised to hold hers. Daren reached for a hand that had not yet realized how much of itself it stood to lose. Elara still did not know what the </w:t>
+      </w:r>
+      <w:r>
+        <w:lastRenderedPageBreak/>
+        <w:t>two letters meant. Daren knew exactly what they meant, but not yet how much of the road ahead had already been laid by the man who had taught him to sign them.</w:t>
+      </w:r>
+    </w:p>
+    <w:p>
+      <w:r>
+        <w:t>At 4:00 a.m., Rohan was awake in the Ashoka barracks.</w:t>
+      </w:r>
+    </w:p>
+    <w:p>
+      <w:r>
+        <w:t>The room held nothing that did not serve discipline. A narrow bed. A folded uniform. A wash basin of brushed steel. A rack for boots and armor, each piece aligned to the edge of its mark on the floor. The walls were bare except for the Ashoka insignia above the door, rendered in matte red, not decorative enough to be admired and not subtle enough to be forgotten.</w:t>
+      </w:r>
+    </w:p>
+    <w:p>
+      <w:r>
+        <w:t>Rohan moved through the final sequence of his morning routine without sound. It was not the kind of exercise designed to build muscle for display. Ashoka had no use for display. The movements were slow, punishing, and exact: holds that made the tendons tremble, controlled descents that denied the body momentum, breath measured against strain until the mind stopped asking when it would end. The purpose was not strength alone. Strength could be trained by machinery. This was obedience under pressure, pain wit</w:t>
+      </w:r>
+      <w:r>
+        <w:t>hout spectacle, the old lesson driven into bone one repetition at a time: failure might happen, but surrender was never permitted to arrive first.</w:t>
+      </w:r>
+    </w:p>
+    <w:p>
+      <w:r>
+        <w:t>His face did not change. Sweat moved along his temple and down the scar at his jaw, but his expression remained carved into the same hard stillness he carried into every room. Not anger. Not calm. Something more severe than both, as though the body had been given a command and the man inside it had agreed never to negotiate.</w:t>
+      </w:r>
+    </w:p>
+    <w:p>
+      <w:r>
+        <w:t>He lowered himself into the last hold when a pale rectangle slipped beneath the door.</w:t>
+      </w:r>
+    </w:p>
+    <w:p>
+      <w:r>
+        <w:t>Rohan did not move toward it at once.</w:t>
+      </w:r>
+    </w:p>
+    <w:p>
+      <w:r>
+        <w:t>The paper came to rest just inside the threshold, white against the dark floor. No chime followed. No guard announced a summons. No official seal lit the reader beside the door. Whoever had delivered it had chosen paper because paper did not require the system to admit it had carried a message.</w:t>
+      </w:r>
+    </w:p>
+    <w:p>
+      <w:r>
+        <w:t>Only when the final breath count ended did Rohan rise.</w:t>
+      </w:r>
+    </w:p>
+    <w:p>
+      <w:r>
+        <w:t>He crossed the room and picked up the letter. The paper was plain, not Kubera's heavy stock with its hidden fibers and quiet expense. It was handwritten, which ruled out Ashoka's clipped typed orders. It carried no Chanakya routing language, no policy frame soft enough to mean three things at once. That left Drona. And when Rohan thought of Drona, Elara's name arrived before he unfolded the page.</w:t>
+      </w:r>
+    </w:p>
+    <w:p>
+      <w:r>
+        <w:t>When he opened it, her name was waiting at the top.</w:t>
+      </w:r>
+    </w:p>
+    <w:p>
+      <w:r>
+        <w:t>Elara Nathan.</w:t>
+      </w:r>
+    </w:p>
+    <w:p>
+      <w:r>
+        <w:rPr>
+          <w:highlight w:val="yellow"/>
+        </w:rPr>
+        <w:lastRenderedPageBreak/>
+        <w:t>His eyes moved once down the sheet before he began to read. Her name appeared again in the body, then again near the bottom, not as decoration or plea but as a careful mark of responsibility. She had not hidden behind the paper. She had placed herself inside it.</w:t>
       </w:r>
     </w:p>
     <w:sectPr>
@@ -499,31 +601,31 @@
       </w:rPr>
     </w:lvl>
   </w:abstractNum>
-  <w:num w:numId="1" w16cid:durableId="1593515259">
+  <w:num w:numId="1" w16cid:durableId="1544053020">
     <w:abstractNumId w:val="8"/>
   </w:num>
-  <w:num w:numId="2" w16cid:durableId="1580408344">
+  <w:num w:numId="2" w16cid:durableId="1417482590">
     <w:abstractNumId w:val="6"/>
   </w:num>
-  <w:num w:numId="3" w16cid:durableId="716971888">
+  <w:num w:numId="3" w16cid:durableId="364520078">
     <w:abstractNumId w:val="5"/>
   </w:num>
-  <w:num w:numId="4" w16cid:durableId="580725809">
+  <w:num w:numId="4" w16cid:durableId="1624338771">
     <w:abstractNumId w:val="4"/>
   </w:num>
-  <w:num w:numId="5" w16cid:durableId="564730575">
+  <w:num w:numId="5" w16cid:durableId="1657607501">
     <w:abstractNumId w:val="7"/>
   </w:num>
-  <w:num w:numId="6" w16cid:durableId="491916646">
+  <w:num w:numId="6" w16cid:durableId="1574194779">
     <w:abstractNumId w:val="3"/>
   </w:num>
-  <w:num w:numId="7" w16cid:durableId="348333263">
+  <w:num w:numId="7" w16cid:durableId="1997151299">
     <w:abstractNumId w:val="2"/>
   </w:num>
-  <w:num w:numId="8" w16cid:durableId="2017994457">
+  <w:num w:numId="8" w16cid:durableId="66653401">
     <w:abstractNumId w:val="1"/>
   </w:num>
-  <w:num w:numId="9" w16cid:durableId="210042984">
+  <w:num w:numId="9" w16cid:durableId="432868377">
     <w:abstractNumId w:val="0"/>
   </w:num>
 </w:numbering>

</xml_diff>

<commit_message>
Clarify Chapter 11 chronology
</commit_message>
<xml_diff>
--- a/manuscript/chapter-11-the-weakening.docx
+++ b/manuscript/chapter-11-the-weakening.docx
@@ -77,7 +77,7 @@
     </w:p>
     <w:p>
       <w:r>
-        <w:t>Three floors above the residential wing that no longer held any record of him, Daren sat in a room Kubera had once assigned and never reclaimed, and he was not afraid of anything.</w:t>
+        <w:t>Three floors above the residential wing, Daren sat in the room Kubera had assigned to him when he was still a representative. After his removal, no one had formally reclaimed it. The institution no longer acknowledged him as its occupant, but the room remained available, and Daren had returned because he had nowhere else to go. He was not afraid of anything.</w:t>
       </w:r>
     </w:p>
     <w:p>
@@ -136,16 +136,7 @@
     </w:p>
     <w:p>
       <w:r>
-        <w:rPr>
-          <w:i/>
-          <w:color w:val="5C6B7D"/>
-        </w:rPr>
-        <w:t>Below, resistance was learning to draw itself in charcoal on a shack wall. Above, Daren was drawing a colder map, one made of allocations, gifts, and institutions too pleased to ask why they had been chosen.</w:t>
-      </w:r>
-    </w:p>
-    <w:p>
-      <w:r>
-        <w:t>He had not chosen Drona only because it was vulnerable to the tactic. He had chosen it because of Elara. Her correction in front of the others. Her report that kept the three boys together. Her name in the audit stream beside the failure the Grandmaster had made him carry like a verdict.</w:t>
+        <w:t>He had not chosen Drona only because it was vulnerable to the tactic. He had chosen it because of Elara: her correction in front of the others, her report that kept the three boys together, and her name in the audit stream beside the failure the Grandmaster had made him carry like a verdict.</w:t>
       </w:r>
     </w:p>
     <w:p>
@@ -233,7 +224,7 @@
     </w:p>
     <w:p>
       <w:r>
-        <w:t>At the base of the transfer, where a signature was required by a protocol too old to demand a name, he entered two letters.</w:t>
+        <w:t>At the base of the transfer, where a signature was required by a protocol too old to demand a name, the field accepted two letters he had used before.</w:t>
       </w:r>
     </w:p>
     <w:p>
@@ -258,7 +249,7 @@
     </w:p>
     <w:p>
       <w:r>
-        <w:t>Somewhere below him, in a room he had never seen and would likely never enter, a woman he had once accused in front of three watching consoles was awake at an hour meant for sleep, turning over the same two letters he had spent a month arranging never to be found.</w:t>
+        <w:t>Somewhere below him, in a room he had never seen and would likely never enter, a woman he had once accused in front of three watching consoles was awake at an hour meant for sleep, turning over the same two letters he had spent a month hiding from the modern archive.</w:t>
       </w:r>
     </w:p>
     <w:p>
@@ -367,7 +358,7 @@
     </w:p>
     <w:p>
       <w:r>
-        <w:t>Rohan moved through the final sequence of his morning routine without sound. It was not the kind of exercise designed to build muscle for display. Ashoka had no use for display. The movements were slow, punishing, and exact: holds that made the tendons tremble, controlled descents that denied the body momentum, breath measured against strain until the mind stopped asking when it would end. The purpose was not strength alone. Strength could be trained by machinery. This was obedience under pressure, pain without spectacle, the old lesson driven into bone one repetition at a time: failure might happen, but surrender was never permitted to arrive first.</w:t>
+        <w:t>Rohan moved through the final sequence of his morning routine without sound. He held a low horse stance until his thighs trembled, lowered through five controlled push-ups without letting his chest touch the floor, then settled into a forearm plank while counting each breath. It was not the kind of exercise designed to build muscle for display. Ashoka had no use for display. The movements were slow, punishing, and exact: holds that made the tendons tremble, controlled descents that denied the body momentum, breath measured against strain until the mind stopped asking when it would end. The purpose was not strength alone. Strength could be trained by machinery. This was obedience under pressure, pain without spectacle, the old lesson driven into bone one repetition at a time: failure might happen, but surrender was never permitted to arrive first.</w:t>
       </w:r>
     </w:p>
     <w:p>

</xml_diff>

<commit_message>
Ch10: fix doubled time-stamp; Ch11: vary frame pair, seal Daren's wound, fix month timeline, trim Rohan section; Ch12: trim travelogue, spoken confession to Rohan, clipped Ashoka speech
</commit_message>
<xml_diff>
--- a/manuscript/chapter-11-the-weakening.docx
+++ b/manuscript/chapter-11-the-weakening.docx
@@ -101,7 +101,7 @@
     </w:p>
     <w:p>
       <w:r>
-        <w:t>None of it frightened him.</w:t>
+        <w:t>None of it frightened him. Fear, he understood when he went looking for it, had lived in the things Kubera could take away — the rank, the record, the name. All three were gone, and the erasure had taken his fear with them.</w:t>
       </w:r>
     </w:p>
     <w:p>
@@ -263,7 +263,7 @@
     </w:p>
     <w:p>
       <w:r>
-        <w:t>Somewhere below him, in a room he had never seen and would likely never enter, a woman he had once accused in front of three watching consoles was awake at an hour meant for sleep, turning over the same two letters he had spent a month hiding from the modern archive.</w:t>
+        <w:t>Somewhere below him, in a room he had never seen and would likely never enter, a woman he had once accused in front of three watching consoles was awake at an hour meant for sleep, turning over the same two letters he had buried beneath a protocol too old to be questioned.</w:t>
       </w:r>
     </w:p>
     <w:p>
@@ -308,7 +308,7 @@
     </w:p>
     <w:p>
       <w:r>
-        <w:t>If Drona and Ashoka ever stood side by side in the same frame, it would not resemble an alliance drawn on paper. It would look like a lantern set into an open palm still scarred from the last thing it had held without flinching, the patient blue light of one gana resting inside the disciplined grip of the other, neither one dimming the other, neither one willing to close.</w:t>
+        <w:t>If Drona and Ashoka ever stood side by side in the same frame, it would not resemble an alliance drawn on paper. It would look like a lantern set into a scarred open palm — patient light resting inside a disciplined grip, neither one dimming the other, neither one willing to close.</w:t>
       </w:r>
     </w:p>
     <w:p>
@@ -343,7 +343,7 @@
     </w:p>
     <w:p>
       <w:r>
-        <w:t>If Kubera and Chanakya ever stood side by side in the same frame, it would not resemble conspiracy. It would look almost respectable, a hand heavy with gold resting on the shoulder of a hand that had spent years writing the rules gold was supposed to obey, both of them smiling at the exact moment a rule quietly changed what it meant.</w:t>
+        <w:t>Kubera and Chanakya together would look nothing like conspiracy. Almost respectable, in fact: a hand heavy with gold resting on the shoulder of the hand that had spent years writing the rules gold was supposed to obey, both of them smiling at the exact moment a rule quietly changed what it meant.</w:t>
       </w:r>
     </w:p>
     <w:p>
@@ -363,12 +363,12 @@
     </w:p>
     <w:p>
       <w:r>
-        <w:t>Rohan moved through the final sequence of his morning routine without sound. He held a low horse stance until his thighs trembled, lowered through five controlled push-ups without letting his chest touch the floor, then settled into a forearm plank while counting each breath. It was not the kind of exercise designed to build muscle for display. Ashoka had no use for display. The movements were slow, punishing, and exact: holds that made the tendons tremble, controlled descents that denied the body momentum, breath measured against strain until the mind stopped asking when it would end. The purpose was not strength alone. Strength could be trained by machinery. This was obedience under pressure, pain without spectacle, the old lesson driven into bone one repetition at a time: failure might happen, but surrender was never permitted to arrive first.</w:t>
+        <w:t>Rohan moved through the final sequence of his morning routine without sound: a low horse stance held until his thighs trembled, controlled descents that denied the body momentum, breath measured against strain until the mind stopped asking when it would end. Ashoka had no use for display. This was obedience under pressure, the old lesson driven into bone one repetition at a time: failure might happen, but surrender was never permitted to arrive first.</w:t>
       </w:r>
     </w:p>
     <w:p>
       <w:r>
-        <w:t>His face did not change. Sweat moved along his temple and down the scar at his jaw, but his expression remained carved into the same hard stillness he carried into every room. Not anger. Not calm. Something more severe than both, as though the body had been given a command and the man inside it had agreed never to negotiate.</w:t>
+        <w:t>Sweat moved down the scar at his jaw, but his expression kept the hard stillness he carried into every room, as though the body had been given a command and the man inside it had agreed never to negotiate.</w:t>
       </w:r>
     </w:p>
     <w:p>

</xml_diff>

<commit_message>
Ch11 review fixes (Ravi build-up, Dhamma pledge grounding, authority = Office of the Grandmaster Drona, fear/quarters/lantern/letter-bridge edits); Ch12 ground scene cut (epigraph-only device); Ch9 room-reclaim trim; tracker decisions
</commit_message>
<xml_diff>
--- a/manuscript/chapter-11-the-weakening.docx
+++ b/manuscript/chapter-11-the-weakening.docx
@@ -40,7 +40,7 @@
     </w:p>
     <w:p>
       <w:r>
-        <w:t>She had taken the library-wing transfer as far as Drona's records could carry her. Anandi had opened the doors her clearance could open. Kavik had rebuilt the ledger path the modern archive no longer displayed. Together, they had moved from the public approval to the departmental copy, from the fiscal ledger to the native authorization itself.</w:t>
+        <w:t>She had taken the library-wing transfer as far as Drona's records could carry her. Anandi had known what no clearance could replace: the Sākṣī path, the old witness convention the modern interface had forgotten. Kavik had rebuilt the ledger sequence that led down it. Together, they had moved from the public approval to the departmental copy, from the fiscal ledger to the native authorization itself.</w:t>
       </w:r>
     </w:p>
     <w:p>
@@ -55,12 +55,12 @@
     </w:p>
     <w:p>
       <w:r>
-        <w:t>No registry entry. No retired title. No office, elder, committee, or forgotten designation matched it. The archive accepted the signature, but it would not explain it.</w:t>
+        <w:t>Every signature in the archive was a door that led back to a person — an office, an elder, a chain of succession. This one led back to nothing. The system obeyed the two letters without being able to say whom it was obeying.</w:t>
       </w:r>
     </w:p>
     <w:p>
       <w:r>
-        <w:t>That was the wall. Not a locked door she had failed to open, but a wall with no visible top and no visible end.</w:t>
+        <w:t>That was the wall. Not a locked door she had failed to open, but a wall that ran farther than she could see in any direction, with nothing to climb and no edge to walk around.</w:t>
       </w:r>
     </w:p>
     <w:p>
@@ -70,7 +70,7 @@
     </w:p>
     <w:p>
       <w:r>
-        <w:t>She recognized the sensation before she named it. It was not the panic the Ancient One's raised hand had forced into her body in the council chamber, but it came from the same place: the fear of a system that could take away air, answers, or standing whenever it chose.</w:t>
+        <w:t>She recognized the sensation before she named it. It was not the panic the Ancient One's raised hand had forced into her body in the council chamber, but it came from the same place. There, the system had taken her air. Here, it simply declined to give her an answer — and the refusal frightened her the same way, because both told her the same thing: what she received was never hers. It was issued, and it could be withheld.</w:t>
       </w:r>
     </w:p>
     <w:p>
@@ -100,12 +100,12 @@
     </w:p>
     <w:p>
       <w:r>
-        <w:t>Three floors above the residential wing, Daren sat in the room Kubera had assigned to him when he was still a representative. After his removal, no one had formally reclaimed it. The institution no longer acknowledged him as its occupant, but the room remained available, and Daren had returned because he had nowhere else to go. He was not afraid of anything.</w:t>
+        <w:t>Three floors above the residential wing, Daren sat in the room Kubera had assigned to him when he was still a representative. After his removal, no one had formally reclaimed it. Meru had made him into its weapon, but a weapon is stored, not housed: no quarters could be assigned to a man who no longer appeared in any record. Meru could have found him an unlisted corner nearer the Grandmaster, and that was exactly why it would not. Proximity was a record of its own, and too many faces on Kubera's tier had watched his removal. A weapon was kept where it was aimed: his work lay down here, among the ganas, and in a monitor tower whose guests rotated away every cycle, no one looked twice at a man who stayed. He was not afraid of anything.</w:t>
       </w:r>
     </w:p>
     <w:p>
       <w:r>
-        <w:t>He knew that should have troubled him. He was moving against another gana in secret. He carried a power he did not yet understand. He was starting something that could not be easily undone.</w:t>
+        <w:t>It was the absence itself that should have troubled him. He was moving against another gana in secret. He carried a power he did not yet understand. He was starting something that could not be easily undone. Any man doing these things ought to feel fear.</w:t>
       </w:r>
     </w:p>
     <w:p>
@@ -149,7 +149,7 @@
     </w:p>
     <w:p>
       <w:r>
-        <w:t>The only question left was which gana to test the method on first.</w:t>
+        <w:t>In the first hours after the chamber, only one question had remained: which gana to test the method on first.</w:t>
       </w:r>
     </w:p>
     <w:p>
@@ -183,12 +183,12 @@
     </w:p>
     <w:p>
       <w:r>
-        <w:t>The cross-gana requisition ledger was not truly classified. It was merely tedious, which made it almost as safe as secrecy. Daren cross-checked Drona's open requests against Kubera's internal return projections. Drona ranked a thing by what it could teach. Kubera ranked it by what it would return.</w:t>
+        <w:t>The cross-gana requisition ledger was not truly classified. It was merely tedious, which made it almost as safe as secrecy. Daren had cross-checked Drona's open requests against Kubera's internal return projections. Drona ranked a thing by what it could teach. Kubera ranked it by what it would return.</w:t>
       </w:r>
     </w:p>
     <w:p>
       <w:r>
-        <w:t>In the gap between those two measures, he found the opening.</w:t>
+        <w:t>In the gap between those two measures, he had found the opening.</w:t>
       </w:r>
     </w:p>
     <w:p>
@@ -322,7 +322,7 @@
     </w:p>
     <w:p>
       <w:r>
-        <w:t>If Drona and Ashoka ever stood side by side in the same frame, it would not resemble an alliance drawn on paper. It would look like a lantern set into a scarred open palm — patient light resting inside a disciplined grip, neither one dimming the other, neither one willing to close.</w:t>
+        <w:t>If Drona and Ashoka ever stood side by side in the same frame, it would not resemble an alliance drawn on paper. It would look like a lantern set into a scarred open palm — patient light resting inside a disciplined grip: the hand never closing over the flame, the flame never asking the hand to soften.</w:t>
       </w:r>
     </w:p>
     <w:p>
@@ -337,7 +337,17 @@
     </w:p>
     <w:p>
       <w:r>
-        <w:t>The bracelet gave Daren reach. It did not give him cover. If he pushed too openly, Trinity would feel the pressure and harden around it. Ravi offered a different kind of force: the ability to turn a pressure into an interpretation, and an interpretation into policy.</w:t>
+        <w:t>The bracelet gave Daren reach. It did not give him cover. If he pushed too openly, Trinity would feel the pressure and harden around it. What he needed lived in the other house: someone inside Chanakya who could turn a pressure into an interpretation, and an interpretation into policy.</w:t>
+      </w:r>
+    </w:p>
+    <w:p>
+      <w:r>
+        <w:t>Then he thought of the EVENT console in the Tier-1 monitoring room, one station along from his own, and the man who had run it through the whole Initiation watch.</w:t>
+      </w:r>
+    </w:p>
+    <w:p>
+      <w:r>
+        <w:t>Ravi.</w:t>
       </w:r>
     </w:p>
     <w:p>
@@ -367,7 +377,12 @@
     </w:p>
     <w:p>
       <w:r>
-        <w:t>At 4:00 a.m., Rohan was awake in the Ashoka barracks.</w:t>
+        <w:t>One of those reaches was already moving. Elara's letter — a single folded sheet of paper — was on its way to a door in the Ashoka barracks.</w:t>
+      </w:r>
+    </w:p>
+    <w:p>
+      <w:r>
+        <w:t>At 4:00 a.m., Rohan was awake behind that door.</w:t>
       </w:r>
     </w:p>
     <w:p>
@@ -377,7 +392,7 @@
     </w:p>
     <w:p>
       <w:r>
-        <w:t>Rohan moved through the final sequence of his morning routine without sound: a low horse stance held until his thighs trembled, controlled descents that denied the body momentum, breath measured against strain until the mind stopped asking when it would end. Ashoka had no use for display. This was obedience under pressure, the old lesson driven into bone one repetition at a time: failure might happen, but surrender was never permitted to arrive first.</w:t>
+        <w:t>Rohan was finishing his morning conditioning without sound: a low horse stance held until his thighs trembled, controlled descents that denied the body momentum, breath measured against strain until the mind stopped asking when it would end. Ashoka had no use for display. This was obedience under pressure, the old lesson driven into bone one repetition at a time: failure might happen, but surrender was never permitted to arrive first.</w:t>
       </w:r>
     </w:p>
     <w:p>
@@ -397,7 +412,7 @@
     </w:p>
     <w:p>
       <w:r>
-        <w:t>The paper came to rest just inside the threshold, white against the dark floor. No chime followed. No guard announced a summons. No official seal lit the reader beside the door. Whoever had delivered it had chosen paper because paper did not require the system to admit it had carried a message.</w:t>
+        <w:t>The paper came to rest just inside the threshold, white against the dark floor. No chime followed. No guard announced a summons. No official seal lit the reader beside the door.</w:t>
       </w:r>
     </w:p>
     <w:p>
@@ -407,7 +422,7 @@
     </w:p>
     <w:p>
       <w:r>
-        <w:t>He crossed the room and picked up the letter. The paper was plain, not Kubera's heavy stock with its hidden fibers and quiet expense. It was handwritten, which ruled out Ashoka's clipped typed orders. It carried no Chanakya routing language, no policy frame soft enough to mean three things at once. That left Drona.</w:t>
+        <w:t>He crossed the room and picked up the letter. Paper, not a pane — whoever had sent it had chosen the one carrier that did not require the system to admit a message had moved. The paper was plain, not Kubera's heavy stock with its hidden fibers and quiet expense. It was handwritten, which ruled out Ashoka's clipped typed orders. It carried no Chanakya routing language, no policy frame soft enough to mean three things at once. That left Drona.</w:t>
       </w:r>
     </w:p>
     <w:p>
@@ -452,7 +467,7 @@
     </w:p>
     <w:p>
       <w:r>
-        <w:t>Before he finished reading the message, he had already decided to stand with her. No order required it. He saw no strategic advantage in it. He simply knew that leaving her to face it alone would be wrong. Ashoka called that instinct Dhamma (supreme duty).</w:t>
+        <w:t>Before he finished reading the message, the decision was already made. No order required it, and he did not search for one. He had given his word in a room lit blue, with three ganas watching, and he had given it for a reason he could have defended before any tribunal in Ashoka: he had watched a representative hold the line for three boys who had held it for each other, and then watched the system turn on her for it while Daren, his judgment run through with anger, advanced on her station. Ashoka existed for exactly that moment — to stand between a person and an accusation until fairness, not anger, decided the outcome. He had said eight words and walked away before she could ask what they would cost him, because the cost was not her concern. A word did not expire because keeping it had become inconvenient. Ashoka called that obligation Dhamma (supreme duty): the duty that stood above orders, owed not to the chain of command but to what was right.</w:t>
       </w:r>
     </w:p>
     <w:p>
@@ -477,12 +492,22 @@
     </w:p>
     <w:p>
       <w:r>
-        <w:t>REQUESTING GANA: DRONA. PURPOSE: PROCEDURAL CONSULTATION. AUTHORITY: UNLISTED.</w:t>
+        <w:t>REQUESTING GANA: DRONA.</w:t>
       </w:r>
     </w:p>
     <w:p>
       <w:r>
-        <w:t>Rohan read the final line twice. Elara had sent a letter to arrange a meeting that the room had already been prepared to receive.</w:t>
+        <w:t>PURPOSE: PROCEDURAL CONSULTATION.</w:t>
+      </w:r>
+    </w:p>
+    <w:p>
+      <w:r>
+        <w:t>AUTHORITY: OFFICE OF THE GRANDMASTER, DRONA.</w:t>
+      </w:r>
+    </w:p>
+    <w:p>
+      <w:r>
+        <w:t>Rohan read the final line twice. A handwritten letter slipped beneath a door, touching no system — and beneath the letter, the stamped authority of Drona's own Grandmaster. Elara had not merely chosen her door carefully. Someone far above her had quietly agreed to hold it open.</w:t>
       </w:r>
     </w:p>
     <w:p>

</xml_diff>